<commit_message>
Wzor SWA B-02: usuniecie pola 'Numer w rejestrze'
</commit_message>
<xml_diff>
--- a/public/wzory/SWA_B-02_Arkusz_Diagnozy_Kompleksowej_szablon.docx
+++ b/public/wzory/SWA_B-02_Arkusz_Diagnozy_Kompleksowej_szablon.docx
@@ -225,71 +225,6 @@
                 <w:szCs w:val="20"/>
               </w:rPr>
               <w:t>{{pesel}}</w:t>
-            </w:r>
-          </w:p>
-        </w:tc>
-      </w:tr>
-      <w:tr>
-        <w:tc>
-          <w:tcPr>
-            <w:tcW w:w="3000" w:type="dxa"/>
-            <w:tcBorders>
-              <w:top w:val="single" w:sz="4" w:space="0" w:color="999999"/>
-              <w:left w:val="single" w:sz="4" w:space="0" w:color="999999"/>
-              <w:bottom w:val="single" w:sz="4" w:space="0" w:color="999999"/>
-              <w:right w:val="single" w:sz="4" w:space="0" w:color="999999"/>
-            </w:tcBorders>
-            <w:shd w:val="clear" w:color="auto" w:fill="F2F2F2"/>
-            <w:tcMar>
-              <w:top w:w="60" w:type="dxa"/>
-              <w:left w:w="100" w:type="dxa"/>
-              <w:bottom w:w="60" w:type="dxa"/>
-              <w:right w:w="100" w:type="dxa"/>
-            </w:tcMar>
-          </w:tcPr>
-          <w:p>
-            <w:pPr>
-              <w:spacing w:after="40" w:before="0"/>
-            </w:pPr>
-            <w:r>
-              <w:rPr>
-                <w:rFonts w:ascii="Arial" w:hAnsi="Arial" w:cs="Arial"/>
-                <w:sz w:val="20"/>
-                <w:szCs w:val="20"/>
-                <w:b/>
-                <w:bCs/>
-              </w:rPr>
-              <w:t xml:space="preserve">Numer w rejestrze</w:t>
-            </w:r>
-          </w:p>
-        </w:tc>
-        <w:tc>
-          <w:tcPr>
-            <w:tcW w:w="6072" w:type="dxa"/>
-            <w:tcBorders>
-              <w:top w:val="single" w:sz="4" w:space="0" w:color="999999"/>
-              <w:left w:val="single" w:sz="4" w:space="0" w:color="999999"/>
-              <w:bottom w:val="single" w:sz="4" w:space="0" w:color="999999"/>
-              <w:right w:val="single" w:sz="4" w:space="0" w:color="999999"/>
-            </w:tcBorders>
-            <w:tcMar>
-              <w:top w:w="60" w:type="dxa"/>
-              <w:left w:w="100" w:type="dxa"/>
-              <w:bottom w:w="60" w:type="dxa"/>
-              <w:right w:w="100" w:type="dxa"/>
-            </w:tcMar>
-          </w:tcPr>
-          <w:p>
-            <w:pPr>
-              <w:spacing w:after="40" w:before="0"/>
-            </w:pPr>
-            <w:r>
-              <w:rPr>
-                <w:rFonts w:ascii="Arial" w:hAnsi="Arial" w:cs="Arial"/>
-                <w:sz w:val="20"/>
-                <w:szCs w:val="20"/>
-              </w:rPr>
-              <w:t xml:space="preserve"/>
             </w:r>
           </w:p>
         </w:tc>

</xml_diff>